<commit_message>
Add requested optimisation and Epic Fight compat mods (v1.2.0)
Add AllTheLeaks, Fast Noise, Particle Core (+Fzzy Config), Model Gap
Fix, Saturn, Epic Recruits, Epic Fight Compat Suite, Epic Fight &
Cataclysm compatibility and Mouse Tweaks. Fast Noise replaces Noisium,
which is archived and has no CurseForge files left. Particle Core is
listed as client-only for servers. Verified by server and client join
tests; Epic Fight-patched entity types rose from 60 to 70.

Co-Authored-By: Claude Opus 5.5 <noreply@anthropic.com>
Claude-Session: https://claude.ai/code/session_014Jbf8kgfBVoy9wyoxTNfjg
</commit_message>
<xml_diff>
--- a/MDVLCraft-Optimisation-and-Improvement-Mods.docx
+++ b/MDVLCraft-Optimisation-and-Improvement-Mods.docx
@@ -46,7 +46,7 @@
           <w:sz w:val="22"/>
           <w:szCs w:val="22"/>
         </w:rPr>
-        <w:t xml:space="preserve">Minecraft 1.20.1 · Forge 47.4.10 · Java 17 · merged pack of 130 mods (MDVL + MDVLCraft), October 2026.</w:t>
+        <w:t xml:space="preserve">Minecraft 1.20.1 · Forge 47.4.10 · Java 17 · MDVLCraft v1.2.0 (142 files: MDVL + MDVLCraft + v1.2.0 additions), October 2026.</w:t>
       </w:r>
     </w:p>
     <w:p>
@@ -84,7 +84,7 @@
           <w:sz w:val="22"/>
           <w:szCs w:val="22"/>
         </w:rPr>
-        <w:t xml:space="preserve">These are installed in the merged pack and were running during testing. Keep them.</w:t>
+        <w:t xml:space="preserve">These are installed in the pack and were running during testing. Epic Recruits, Epic Fight Compat Suite, Epic Fight &amp; Cataclysm compatibility and Mouse Tweaks were also added in v1.2.0. Keep them.</w:t>
       </w:r>
     </w:p>
     <w:tbl>
@@ -1597,6 +1597,361 @@
                 <w:szCs w:val="19"/>
               </w:rPr>
               <w:t xml:space="preserve">Profiler: find what is causing lag.</w:t>
+            </w:r>
+          </w:p>
+        </w:tc>
+      </w:tr>
+      <w:tr>
+        <w:tc>
+          <w:tcPr>
+            <w:tcW w:type="dxa" w:w="2600"/>
+            <w:tcMar>
+              <w:top w:type="dxa" w:w="60"/>
+              <w:left w:type="dxa" w:w="100"/>
+              <w:bottom w:type="dxa" w:w="60"/>
+              <w:right w:type="dxa" w:w="100"/>
+            </w:tcMar>
+          </w:tcPr>
+          <w:p>
+            <w:r>
+              <w:rPr>
+                <w:rFonts w:ascii="Calibri" w:cs="Calibri" w:eastAsia="Calibri" w:hAnsi="Calibri"/>
+                <w:b w:val="false"/>
+                <w:bCs w:val="false"/>
+                <w:sz w:val="19"/>
+                <w:szCs w:val="19"/>
+              </w:rPr>
+              <w:t xml:space="preserve">AllTheLeaks (added v1.2.0)</w:t>
+            </w:r>
+          </w:p>
+        </w:tc>
+        <w:tc>
+          <w:tcPr>
+            <w:tcW w:type="dxa" w:w="800"/>
+            <w:tcMar>
+              <w:top w:type="dxa" w:w="60"/>
+              <w:left w:type="dxa" w:w="100"/>
+              <w:bottom w:type="dxa" w:w="60"/>
+              <w:right w:type="dxa" w:w="100"/>
+            </w:tcMar>
+          </w:tcPr>
+          <w:p>
+            <w:r>
+              <w:rPr>
+                <w:rFonts w:ascii="Calibri" w:cs="Calibri" w:eastAsia="Calibri" w:hAnsi="Calibri"/>
+                <w:b w:val="false"/>
+                <w:bCs w:val="false"/>
+                <w:sz w:val="19"/>
+                <w:szCs w:val="19"/>
+              </w:rPr>
+              <w:t xml:space="preserve">B</w:t>
+            </w:r>
+          </w:p>
+        </w:tc>
+        <w:tc>
+          <w:tcPr>
+            <w:tcW w:type="dxa" w:w="6238"/>
+            <w:tcMar>
+              <w:top w:type="dxa" w:w="60"/>
+              <w:left w:type="dxa" w:w="100"/>
+              <w:bottom w:type="dxa" w:w="60"/>
+              <w:right w:type="dxa" w:w="100"/>
+            </w:tcMar>
+          </w:tcPr>
+          <w:p>
+            <w:r>
+              <w:rPr>
+                <w:rFonts w:ascii="Calibri" w:cs="Calibri" w:eastAsia="Calibri" w:hAnsi="Calibri"/>
+                <w:b w:val="false"/>
+                <w:bCs w:val="false"/>
+                <w:sz w:val="19"/>
+                <w:szCs w:val="19"/>
+              </w:rPr>
+              <w:t xml:space="preserve">Fixes known memory leaks in Forge and mods (two JEI fixes skip on this JEI version - harmless).</w:t>
+            </w:r>
+          </w:p>
+        </w:tc>
+      </w:tr>
+      <w:tr>
+        <w:tc>
+          <w:tcPr>
+            <w:tcW w:type="dxa" w:w="2600"/>
+            <w:tcMar>
+              <w:top w:type="dxa" w:w="60"/>
+              <w:left w:type="dxa" w:w="100"/>
+              <w:bottom w:type="dxa" w:w="60"/>
+              <w:right w:type="dxa" w:w="100"/>
+            </w:tcMar>
+          </w:tcPr>
+          <w:p>
+            <w:r>
+              <w:rPr>
+                <w:rFonts w:ascii="Calibri" w:cs="Calibri" w:eastAsia="Calibri" w:hAnsi="Calibri"/>
+                <w:b w:val="false"/>
+                <w:bCs w:val="false"/>
+                <w:sz w:val="19"/>
+                <w:szCs w:val="19"/>
+              </w:rPr>
+              <w:t xml:space="preserve">Fast Noise (added v1.2.0)</w:t>
+            </w:r>
+          </w:p>
+        </w:tc>
+        <w:tc>
+          <w:tcPr>
+            <w:tcW w:type="dxa" w:w="800"/>
+            <w:tcMar>
+              <w:top w:type="dxa" w:w="60"/>
+              <w:left w:type="dxa" w:w="100"/>
+              <w:bottom w:type="dxa" w:w="60"/>
+              <w:right w:type="dxa" w:w="100"/>
+            </w:tcMar>
+          </w:tcPr>
+          <w:p>
+            <w:r>
+              <w:rPr>
+                <w:rFonts w:ascii="Calibri" w:cs="Calibri" w:eastAsia="Calibri" w:hAnsi="Calibri"/>
+                <w:b w:val="false"/>
+                <w:bCs w:val="false"/>
+                <w:sz w:val="19"/>
+                <w:szCs w:val="19"/>
+              </w:rPr>
+              <w:t xml:space="preserve">S</w:t>
+            </w:r>
+          </w:p>
+        </w:tc>
+        <w:tc>
+          <w:tcPr>
+            <w:tcW w:type="dxa" w:w="6238"/>
+            <w:tcMar>
+              <w:top w:type="dxa" w:w="60"/>
+              <w:left w:type="dxa" w:w="100"/>
+              <w:bottom w:type="dxa" w:w="60"/>
+              <w:right w:type="dxa" w:w="100"/>
+            </w:tcMar>
+          </w:tcPr>
+          <w:p>
+            <w:r>
+              <w:rPr>
+                <w:rFonts w:ascii="Calibri" w:cs="Calibri" w:eastAsia="Calibri" w:hAnsi="Calibri"/>
+                <w:b w:val="false"/>
+                <w:bCs w:val="false"/>
+                <w:sz w:val="19"/>
+                <w:szCs w:val="19"/>
+              </w:rPr>
+              <w:t xml:space="preserve">Faster world-generation noise. Used instead of Noisium, which is archived and has no CurseForge files.</w:t>
+            </w:r>
+          </w:p>
+        </w:tc>
+      </w:tr>
+      <w:tr>
+        <w:tc>
+          <w:tcPr>
+            <w:tcW w:type="dxa" w:w="2600"/>
+            <w:tcMar>
+              <w:top w:type="dxa" w:w="60"/>
+              <w:left w:type="dxa" w:w="100"/>
+              <w:bottom w:type="dxa" w:w="60"/>
+              <w:right w:type="dxa" w:w="100"/>
+            </w:tcMar>
+          </w:tcPr>
+          <w:p>
+            <w:r>
+              <w:rPr>
+                <w:rFonts w:ascii="Calibri" w:cs="Calibri" w:eastAsia="Calibri" w:hAnsi="Calibri"/>
+                <w:b w:val="false"/>
+                <w:bCs w:val="false"/>
+                <w:sz w:val="19"/>
+                <w:szCs w:val="19"/>
+              </w:rPr>
+              <w:t xml:space="preserve">Saturn (added v1.2.0)</w:t>
+            </w:r>
+          </w:p>
+        </w:tc>
+        <w:tc>
+          <w:tcPr>
+            <w:tcW w:type="dxa" w:w="800"/>
+            <w:tcMar>
+              <w:top w:type="dxa" w:w="60"/>
+              <w:left w:type="dxa" w:w="100"/>
+              <w:bottom w:type="dxa" w:w="60"/>
+              <w:right w:type="dxa" w:w="100"/>
+            </w:tcMar>
+          </w:tcPr>
+          <w:p>
+            <w:r>
+              <w:rPr>
+                <w:rFonts w:ascii="Calibri" w:cs="Calibri" w:eastAsia="Calibri" w:hAnsi="Calibri"/>
+                <w:b w:val="false"/>
+                <w:bCs w:val="false"/>
+                <w:sz w:val="19"/>
+                <w:szCs w:val="19"/>
+              </w:rPr>
+              <w:t xml:space="preserve">B</w:t>
+            </w:r>
+          </w:p>
+        </w:tc>
+        <w:tc>
+          <w:tcPr>
+            <w:tcW w:type="dxa" w:w="6238"/>
+            <w:tcMar>
+              <w:top w:type="dxa" w:w="60"/>
+              <w:left w:type="dxa" w:w="100"/>
+              <w:bottom w:type="dxa" w:w="60"/>
+              <w:right w:type="dxa" w:w="100"/>
+            </w:tcMar>
+          </w:tcPr>
+          <w:p>
+            <w:r>
+              <w:rPr>
+                <w:rFonts w:ascii="Calibri" w:cs="Calibri" w:eastAsia="Calibri" w:hAnsi="Calibri"/>
+                <w:b w:val="false"/>
+                <w:bCs w:val="false"/>
+                <w:sz w:val="19"/>
+                <w:szCs w:val="19"/>
+              </w:rPr>
+              <w:t xml:space="preserve">Memory/allocation optimisations; overlapping biome-cache patch defers to ModernFix.</w:t>
+            </w:r>
+          </w:p>
+        </w:tc>
+      </w:tr>
+      <w:tr>
+        <w:tc>
+          <w:tcPr>
+            <w:tcW w:type="dxa" w:w="2600"/>
+            <w:tcMar>
+              <w:top w:type="dxa" w:w="60"/>
+              <w:left w:type="dxa" w:w="100"/>
+              <w:bottom w:type="dxa" w:w="60"/>
+              <w:right w:type="dxa" w:w="100"/>
+            </w:tcMar>
+          </w:tcPr>
+          <w:p>
+            <w:r>
+              <w:rPr>
+                <w:rFonts w:ascii="Calibri" w:cs="Calibri" w:eastAsia="Calibri" w:hAnsi="Calibri"/>
+                <w:b w:val="false"/>
+                <w:bCs w:val="false"/>
+                <w:sz w:val="19"/>
+                <w:szCs w:val="19"/>
+              </w:rPr>
+              <w:t xml:space="preserve">Particle Core (added v1.2.0)</w:t>
+            </w:r>
+          </w:p>
+        </w:tc>
+        <w:tc>
+          <w:tcPr>
+            <w:tcW w:type="dxa" w:w="800"/>
+            <w:tcMar>
+              <w:top w:type="dxa" w:w="60"/>
+              <w:left w:type="dxa" w:w="100"/>
+              <w:bottom w:type="dxa" w:w="60"/>
+              <w:right w:type="dxa" w:w="100"/>
+            </w:tcMar>
+          </w:tcPr>
+          <w:p>
+            <w:r>
+              <w:rPr>
+                <w:rFonts w:ascii="Calibri" w:cs="Calibri" w:eastAsia="Calibri" w:hAnsi="Calibri"/>
+                <w:b w:val="false"/>
+                <w:bCs w:val="false"/>
+                <w:sz w:val="19"/>
+                <w:szCs w:val="19"/>
+              </w:rPr>
+              <w:t xml:space="preserve">C</w:t>
+            </w:r>
+          </w:p>
+        </w:tc>
+        <w:tc>
+          <w:tcPr>
+            <w:tcW w:type="dxa" w:w="6238"/>
+            <w:tcMar>
+              <w:top w:type="dxa" w:w="60"/>
+              <w:left w:type="dxa" w:w="100"/>
+              <w:bottom w:type="dxa" w:w="60"/>
+              <w:right w:type="dxa" w:w="100"/>
+            </w:tcMar>
+          </w:tcPr>
+          <w:p>
+            <w:r>
+              <w:rPr>
+                <w:rFonts w:ascii="Calibri" w:cs="Calibri" w:eastAsia="Calibri" w:hAnsi="Calibri"/>
+                <w:b w:val="false"/>
+                <w:bCs w:val="false"/>
+                <w:sz w:val="19"/>
+                <w:szCs w:val="19"/>
+              </w:rPr>
+              <w:t xml:space="preserve">Particle rendering optimisation (needs Fzzy Config). Client-only.</w:t>
+            </w:r>
+          </w:p>
+        </w:tc>
+      </w:tr>
+      <w:tr>
+        <w:tc>
+          <w:tcPr>
+            <w:tcW w:type="dxa" w:w="2600"/>
+            <w:tcMar>
+              <w:top w:type="dxa" w:w="60"/>
+              <w:left w:type="dxa" w:w="100"/>
+              <w:bottom w:type="dxa" w:w="60"/>
+              <w:right w:type="dxa" w:w="100"/>
+            </w:tcMar>
+          </w:tcPr>
+          <w:p>
+            <w:r>
+              <w:rPr>
+                <w:rFonts w:ascii="Calibri" w:cs="Calibri" w:eastAsia="Calibri" w:hAnsi="Calibri"/>
+                <w:b w:val="false"/>
+                <w:bCs w:val="false"/>
+                <w:sz w:val="19"/>
+                <w:szCs w:val="19"/>
+              </w:rPr>
+              <w:t xml:space="preserve">Model Gap Fix (added v1.2.0)</w:t>
+            </w:r>
+          </w:p>
+        </w:tc>
+        <w:tc>
+          <w:tcPr>
+            <w:tcW w:type="dxa" w:w="800"/>
+            <w:tcMar>
+              <w:top w:type="dxa" w:w="60"/>
+              <w:left w:type="dxa" w:w="100"/>
+              <w:bottom w:type="dxa" w:w="60"/>
+              <w:right w:type="dxa" w:w="100"/>
+            </w:tcMar>
+          </w:tcPr>
+          <w:p>
+            <w:r>
+              <w:rPr>
+                <w:rFonts w:ascii="Calibri" w:cs="Calibri" w:eastAsia="Calibri" w:hAnsi="Calibri"/>
+                <w:b w:val="false"/>
+                <w:bCs w:val="false"/>
+                <w:sz w:val="19"/>
+                <w:szCs w:val="19"/>
+              </w:rPr>
+              <w:t xml:space="preserve">C</w:t>
+            </w:r>
+          </w:p>
+        </w:tc>
+        <w:tc>
+          <w:tcPr>
+            <w:tcW w:type="dxa" w:w="6238"/>
+            <w:tcMar>
+              <w:top w:type="dxa" w:w="60"/>
+              <w:left w:type="dxa" w:w="100"/>
+              <w:bottom w:type="dxa" w:w="60"/>
+              <w:right w:type="dxa" w:w="100"/>
+            </w:tcMar>
+          </w:tcPr>
+          <w:p>
+            <w:r>
+              <w:rPr>
+                <w:rFonts w:ascii="Calibri" w:cs="Calibri" w:eastAsia="Calibri" w:hAnsi="Calibri"/>
+                <w:b w:val="false"/>
+                <w:bCs w:val="false"/>
+                <w:sz w:val="19"/>
+                <w:szCs w:val="19"/>
+              </w:rPr>
+              <w:t xml:space="preserve">Removes seams in item models.</w:t>
             </w:r>
           </w:p>
         </w:tc>
@@ -1758,102 +2113,7 @@
             </w:tcMar>
           </w:tcPr>
           <w:p>
-            <w:hyperlink w:history="1" r:id="rIdgwjkndqa0f9tmjsyin5zy">
-              <w:r>
-                <w:rPr>
-                  <w:rStyle w:val="Hyperlink"/>
-                  <w:rFonts w:ascii="Calibri" w:cs="Calibri" w:eastAsia="Calibri" w:hAnsi="Calibri"/>
-                  <w:sz w:val="19"/>
-                  <w:szCs w:val="19"/>
-                </w:rPr>
-                <w:t xml:space="preserve">AllTheLeaks</w:t>
-              </w:r>
-            </w:hyperlink>
-          </w:p>
-        </w:tc>
-        <w:tc>
-          <w:tcPr>
-            <w:tcW w:type="dxa" w:w="800"/>
-            <w:tcMar>
-              <w:top w:type="dxa" w:w="60"/>
-              <w:left w:type="dxa" w:w="100"/>
-              <w:bottom w:type="dxa" w:w="60"/>
-              <w:right w:type="dxa" w:w="100"/>
-            </w:tcMar>
-          </w:tcPr>
-          <w:p>
-            <w:r>
-              <w:rPr>
-                <w:rFonts w:ascii="Calibri" w:cs="Calibri" w:eastAsia="Calibri" w:hAnsi="Calibri"/>
-                <w:b w:val="false"/>
-                <w:bCs w:val="false"/>
-                <w:sz w:val="19"/>
-                <w:szCs w:val="19"/>
-              </w:rPr>
-              <w:t xml:space="preserve">B</w:t>
-            </w:r>
-          </w:p>
-        </w:tc>
-        <w:tc>
-          <w:tcPr>
-            <w:tcW w:type="dxa" w:w="4338"/>
-            <w:tcMar>
-              <w:top w:type="dxa" w:w="60"/>
-              <w:left w:type="dxa" w:w="100"/>
-              <w:bottom w:type="dxa" w:w="60"/>
-              <w:right w:type="dxa" w:w="100"/>
-            </w:tcMar>
-          </w:tcPr>
-          <w:p>
-            <w:r>
-              <w:rPr>
-                <w:rFonts w:ascii="Calibri" w:cs="Calibri" w:eastAsia="Calibri" w:hAnsi="Calibri"/>
-                <w:b w:val="false"/>
-                <w:bCs w:val="false"/>
-                <w:sz w:val="19"/>
-                <w:szCs w:val="19"/>
-              </w:rPr>
-              <w:t xml:space="preserve">Fixes known memory leaks in Forge and popular mods; includes a memory monitor. Very relevant with 15+ dimensions loaded.</w:t>
-            </w:r>
-          </w:p>
-        </w:tc>
-        <w:tc>
-          <w:tcPr>
-            <w:tcW w:type="dxa" w:w="2200"/>
-            <w:tcMar>
-              <w:top w:type="dxa" w:w="60"/>
-              <w:left w:type="dxa" w:w="100"/>
-              <w:bottom w:type="dxa" w:w="60"/>
-              <w:right w:type="dxa" w:w="100"/>
-            </w:tcMar>
-          </w:tcPr>
-          <w:p>
-            <w:r>
-              <w:rPr>
-                <w:rFonts w:ascii="Calibri" w:cs="Calibri" w:eastAsia="Calibri" w:hAnsi="Calibri"/>
-                <w:b w:val="false"/>
-                <w:bCs w:val="false"/>
-                <w:sz w:val="19"/>
-                <w:szCs w:val="19"/>
-              </w:rPr>
-              <w:t xml:space="preserve">1.1.3 (Aug 2026)</w:t>
-            </w:r>
-          </w:p>
-        </w:tc>
-      </w:tr>
-      <w:tr>
-        <w:tc>
-          <w:tcPr>
-            <w:tcW w:type="dxa" w:w="2300"/>
-            <w:tcMar>
-              <w:top w:type="dxa" w:w="60"/>
-              <w:left w:type="dxa" w:w="100"/>
-              <w:bottom w:type="dxa" w:w="60"/>
-              <w:right w:type="dxa" w:w="100"/>
-            </w:tcMar>
-          </w:tcPr>
-          <w:p>
-            <w:hyperlink w:history="1" r:id="rIdexeophbgwgjtgy-rladon">
+            <w:hyperlink w:history="1" r:id="rIdsr5ka956uwe0ylsppajfb">
               <w:r>
                 <w:rPr>
                   <w:rStyle w:val="Hyperlink"/>
@@ -1948,7 +2208,7 @@
             </w:tcMar>
           </w:tcPr>
           <w:p>
-            <w:hyperlink w:history="1" r:id="rIdpd-tbv05s1atpistuiox0">
+            <w:hyperlink w:history="1" r:id="rIdym46dor7aahger68mdvo1">
               <w:r>
                 <w:rPr>
                   <w:rStyle w:val="Hyperlink"/>
@@ -2043,102 +2303,7 @@
             </w:tcMar>
           </w:tcPr>
           <w:p>
-            <w:hyperlink w:history="1" r:id="rIdd-e6sohzuun1wz4wef9sv">
-              <w:r>
-                <w:rPr>
-                  <w:rStyle w:val="Hyperlink"/>
-                  <w:rFonts w:ascii="Calibri" w:cs="Calibri" w:eastAsia="Calibri" w:hAnsi="Calibri"/>
-                  <w:sz w:val="19"/>
-                  <w:szCs w:val="19"/>
-                </w:rPr>
-                <w:t xml:space="preserve">Noisium</w:t>
-              </w:r>
-            </w:hyperlink>
-          </w:p>
-        </w:tc>
-        <w:tc>
-          <w:tcPr>
-            <w:tcW w:type="dxa" w:w="800"/>
-            <w:tcMar>
-              <w:top w:type="dxa" w:w="60"/>
-              <w:left w:type="dxa" w:w="100"/>
-              <w:bottom w:type="dxa" w:w="60"/>
-              <w:right w:type="dxa" w:w="100"/>
-            </w:tcMar>
-          </w:tcPr>
-          <w:p>
-            <w:r>
-              <w:rPr>
-                <w:rFonts w:ascii="Calibri" w:cs="Calibri" w:eastAsia="Calibri" w:hAnsi="Calibri"/>
-                <w:b w:val="false"/>
-                <w:bCs w:val="false"/>
-                <w:sz w:val="19"/>
-                <w:szCs w:val="19"/>
-              </w:rPr>
-              <w:t xml:space="preserve">S</w:t>
-            </w:r>
-          </w:p>
-        </w:tc>
-        <w:tc>
-          <w:tcPr>
-            <w:tcW w:type="dxa" w:w="4338"/>
-            <w:tcMar>
-              <w:top w:type="dxa" w:w="60"/>
-              <w:left w:type="dxa" w:w="100"/>
-              <w:bottom w:type="dxa" w:w="60"/>
-              <w:right w:type="dxa" w:w="100"/>
-            </w:tcMar>
-          </w:tcPr>
-          <w:p>
-            <w:r>
-              <w:rPr>
-                <w:rFonts w:ascii="Calibri" w:cs="Calibri" w:eastAsia="Calibri" w:hAnsi="Calibri"/>
-                <w:b w:val="false"/>
-                <w:bCs w:val="false"/>
-                <w:sz w:val="19"/>
-                <w:szCs w:val="19"/>
-              </w:rPr>
-              <w:t xml:space="preserve">Faster terrain noise generation; pairs with Tectonic and Chunky pre-generation.</w:t>
-            </w:r>
-          </w:p>
-        </w:tc>
-        <w:tc>
-          <w:tcPr>
-            <w:tcW w:type="dxa" w:w="2200"/>
-            <w:tcMar>
-              <w:top w:type="dxa" w:w="60"/>
-              <w:left w:type="dxa" w:w="100"/>
-              <w:bottom w:type="dxa" w:w="60"/>
-              <w:right w:type="dxa" w:w="100"/>
-            </w:tcMar>
-          </w:tcPr>
-          <w:p>
-            <w:r>
-              <w:rPr>
-                <w:rFonts w:ascii="Calibri" w:cs="Calibri" w:eastAsia="Calibri" w:hAnsi="Calibri"/>
-                <w:b w:val="false"/>
-                <w:bCs w:val="false"/>
-                <w:sz w:val="19"/>
-                <w:szCs w:val="19"/>
-              </w:rPr>
-              <w:t xml:space="preserve">2.3.0</w:t>
-            </w:r>
-          </w:p>
-        </w:tc>
-      </w:tr>
-      <w:tr>
-        <w:tc>
-          <w:tcPr>
-            <w:tcW w:type="dxa" w:w="2300"/>
-            <w:tcMar>
-              <w:top w:type="dxa" w:w="60"/>
-              <w:left w:type="dxa" w:w="100"/>
-              <w:bottom w:type="dxa" w:w="60"/>
-              <w:right w:type="dxa" w:w="100"/>
-            </w:tcMar>
-          </w:tcPr>
-          <w:p>
-            <w:hyperlink w:history="1" r:id="rIdrsoihzkhppsbzr_j4nfy1">
+            <w:hyperlink w:history="1" r:id="rId3uutxribqgpyxe_-xl00n">
               <w:r>
                 <w:rPr>
                   <w:rStyle w:val="Hyperlink"/>
@@ -2233,7 +2398,7 @@
             </w:tcMar>
           </w:tcPr>
           <w:p>
-            <w:hyperlink w:history="1" r:id="rIdjll2t4jfaiibwivmfohce">
+            <w:hyperlink w:history="1" r:id="rIdes-nuvh80cfkr5rlkxkek">
               <w:r>
                 <w:rPr>
                   <w:rStyle w:val="Hyperlink"/>
@@ -2328,7 +2493,7 @@
             </w:tcMar>
           </w:tcPr>
           <w:p>
-            <w:hyperlink w:history="1" r:id="rIdbzgnbjrrrsijrgdtq4ugo">
+            <w:hyperlink w:history="1" r:id="rIdp2jpfa3-sl0xxmdujnkgu">
               <w:r>
                 <w:rPr>
                   <w:rStyle w:val="Hyperlink"/>
@@ -2423,7 +2588,7 @@
             </w:tcMar>
           </w:tcPr>
           <w:p>
-            <w:hyperlink w:history="1" r:id="rIdcirwxpdia1ccjxcg0j0dx">
+            <w:hyperlink w:history="1" r:id="rIdlfvnnydx8pihptxdkpqzi">
               <w:r>
                 <w:rPr>
                   <w:rStyle w:val="Hyperlink"/>
@@ -2518,197 +2683,7 @@
             </w:tcMar>
           </w:tcPr>
           <w:p>
-            <w:hyperlink w:history="1" r:id="rIdceme267oqkpaozgcujhaw">
-              <w:r>
-                <w:rPr>
-                  <w:rStyle w:val="Hyperlink"/>
-                  <w:rFonts w:ascii="Calibri" w:cs="Calibri" w:eastAsia="Calibri" w:hAnsi="Calibri"/>
-                  <w:sz w:val="19"/>
-                  <w:szCs w:val="19"/>
-                </w:rPr>
-                <w:t xml:space="preserve">Particle Core</w:t>
-              </w:r>
-            </w:hyperlink>
-          </w:p>
-        </w:tc>
-        <w:tc>
-          <w:tcPr>
-            <w:tcW w:type="dxa" w:w="800"/>
-            <w:tcMar>
-              <w:top w:type="dxa" w:w="60"/>
-              <w:left w:type="dxa" w:w="100"/>
-              <w:bottom w:type="dxa" w:w="60"/>
-              <w:right w:type="dxa" w:w="100"/>
-            </w:tcMar>
-          </w:tcPr>
-          <w:p>
-            <w:r>
-              <w:rPr>
-                <w:rFonts w:ascii="Calibri" w:cs="Calibri" w:eastAsia="Calibri" w:hAnsi="Calibri"/>
-                <w:b w:val="false"/>
-                <w:bCs w:val="false"/>
-                <w:sz w:val="19"/>
-                <w:szCs w:val="19"/>
-              </w:rPr>
-              <w:t xml:space="preserve">C</w:t>
-            </w:r>
-          </w:p>
-        </w:tc>
-        <w:tc>
-          <w:tcPr>
-            <w:tcW w:type="dxa" w:w="4338"/>
-            <w:tcMar>
-              <w:top w:type="dxa" w:w="60"/>
-              <w:left w:type="dxa" w:w="100"/>
-              <w:bottom w:type="dxa" w:w="60"/>
-              <w:right w:type="dxa" w:w="100"/>
-            </w:tcMar>
-          </w:tcPr>
-          <w:p>
-            <w:r>
-              <w:rPr>
-                <w:rFonts w:ascii="Calibri" w:cs="Calibri" w:eastAsia="Calibri" w:hAnsi="Calibri"/>
-                <w:b w:val="false"/>
-                <w:bCs w:val="false"/>
-                <w:sz w:val="19"/>
-                <w:szCs w:val="19"/>
-              </w:rPr>
-              <w:t xml:space="preserve">Particle rendering/culling optimisation. Test alongside AAA Particles and Epic Fight trails before committing.</w:t>
-            </w:r>
-          </w:p>
-        </w:tc>
-        <w:tc>
-          <w:tcPr>
-            <w:tcW w:type="dxa" w:w="2200"/>
-            <w:tcMar>
-              <w:top w:type="dxa" w:w="60"/>
-              <w:left w:type="dxa" w:w="100"/>
-              <w:bottom w:type="dxa" w:w="60"/>
-              <w:right w:type="dxa" w:w="100"/>
-            </w:tcMar>
-          </w:tcPr>
-          <w:p>
-            <w:r>
-              <w:rPr>
-                <w:rFonts w:ascii="Calibri" w:cs="Calibri" w:eastAsia="Calibri" w:hAnsi="Calibri"/>
-                <w:b w:val="false"/>
-                <w:bCs w:val="false"/>
-                <w:sz w:val="19"/>
-                <w:szCs w:val="19"/>
-              </w:rPr>
-              <w:t xml:space="preserve">0.3.3 (Feb 2026)</w:t>
-            </w:r>
-          </w:p>
-        </w:tc>
-      </w:tr>
-      <w:tr>
-        <w:tc>
-          <w:tcPr>
-            <w:tcW w:type="dxa" w:w="2300"/>
-            <w:tcMar>
-              <w:top w:type="dxa" w:w="60"/>
-              <w:left w:type="dxa" w:w="100"/>
-              <w:bottom w:type="dxa" w:w="60"/>
-              <w:right w:type="dxa" w:w="100"/>
-            </w:tcMar>
-          </w:tcPr>
-          <w:p>
-            <w:hyperlink w:history="1" r:id="rIdgbiq20oty2ghads8_nbrv">
-              <w:r>
-                <w:rPr>
-                  <w:rStyle w:val="Hyperlink"/>
-                  <w:rFonts w:ascii="Calibri" w:cs="Calibri" w:eastAsia="Calibri" w:hAnsi="Calibri"/>
-                  <w:sz w:val="19"/>
-                  <w:szCs w:val="19"/>
-                </w:rPr>
-                <w:t xml:space="preserve">Model Gap Fix</w:t>
-              </w:r>
-            </w:hyperlink>
-          </w:p>
-        </w:tc>
-        <w:tc>
-          <w:tcPr>
-            <w:tcW w:type="dxa" w:w="800"/>
-            <w:tcMar>
-              <w:top w:type="dxa" w:w="60"/>
-              <w:left w:type="dxa" w:w="100"/>
-              <w:bottom w:type="dxa" w:w="60"/>
-              <w:right w:type="dxa" w:w="100"/>
-            </w:tcMar>
-          </w:tcPr>
-          <w:p>
-            <w:r>
-              <w:rPr>
-                <w:rFonts w:ascii="Calibri" w:cs="Calibri" w:eastAsia="Calibri" w:hAnsi="Calibri"/>
-                <w:b w:val="false"/>
-                <w:bCs w:val="false"/>
-                <w:sz w:val="19"/>
-                <w:szCs w:val="19"/>
-              </w:rPr>
-              <w:t xml:space="preserve">C</w:t>
-            </w:r>
-          </w:p>
-        </w:tc>
-        <w:tc>
-          <w:tcPr>
-            <w:tcW w:type="dxa" w:w="4338"/>
-            <w:tcMar>
-              <w:top w:type="dxa" w:w="60"/>
-              <w:left w:type="dxa" w:w="100"/>
-              <w:bottom w:type="dxa" w:w="60"/>
-              <w:right w:type="dxa" w:w="100"/>
-            </w:tcMar>
-          </w:tcPr>
-          <w:p>
-            <w:r>
-              <w:rPr>
-                <w:rFonts w:ascii="Calibri" w:cs="Calibri" w:eastAsia="Calibri" w:hAnsi="Calibri"/>
-                <w:b w:val="false"/>
-                <w:bCs w:val="false"/>
-                <w:sz w:val="19"/>
-                <w:szCs w:val="19"/>
-              </w:rPr>
-              <w:t xml:space="preserve">Removes seams in item models (3D weapons); essentially free.</w:t>
-            </w:r>
-          </w:p>
-        </w:tc>
-        <w:tc>
-          <w:tcPr>
-            <w:tcW w:type="dxa" w:w="2200"/>
-            <w:tcMar>
-              <w:top w:type="dxa" w:w="60"/>
-              <w:left w:type="dxa" w:w="100"/>
-              <w:bottom w:type="dxa" w:w="60"/>
-              <w:right w:type="dxa" w:w="100"/>
-            </w:tcMar>
-          </w:tcPr>
-          <w:p>
-            <w:r>
-              <w:rPr>
-                <w:rFonts w:ascii="Calibri" w:cs="Calibri" w:eastAsia="Calibri" w:hAnsi="Calibri"/>
-                <w:b w:val="false"/>
-                <w:bCs w:val="false"/>
-                <w:sz w:val="19"/>
-                <w:szCs w:val="19"/>
-              </w:rPr>
-              <w:t xml:space="preserve">1.15</w:t>
-            </w:r>
-          </w:p>
-        </w:tc>
-      </w:tr>
-      <w:tr>
-        <w:tc>
-          <w:tcPr>
-            <w:tcW w:type="dxa" w:w="2300"/>
-            <w:tcMar>
-              <w:top w:type="dxa" w:w="60"/>
-              <w:left w:type="dxa" w:w="100"/>
-              <w:bottom w:type="dxa" w:w="60"/>
-              <w:right w:type="dxa" w:w="100"/>
-            </w:tcMar>
-          </w:tcPr>
-          <w:p>
-            <w:hyperlink w:history="1" r:id="rIdxfzyivwam4-kloxm3nzns">
+            <w:hyperlink w:history="1" r:id="rIdqbmw2s9xdfh2zywbu5if0">
               <w:r>
                 <w:rPr>
                   <w:rStyle w:val="Hyperlink"/>
@@ -2803,102 +2778,7 @@
             </w:tcMar>
           </w:tcPr>
           <w:p>
-            <w:hyperlink w:history="1" r:id="rId2xqhaq3weh3eggwk_g-ss">
-              <w:r>
-                <w:rPr>
-                  <w:rStyle w:val="Hyperlink"/>
-                  <w:rFonts w:ascii="Calibri" w:cs="Calibri" w:eastAsia="Calibri" w:hAnsi="Calibri"/>
-                  <w:sz w:val="19"/>
-                  <w:szCs w:val="19"/>
-                </w:rPr>
-                <w:t xml:space="preserve">Saturn</w:t>
-              </w:r>
-            </w:hyperlink>
-          </w:p>
-        </w:tc>
-        <w:tc>
-          <w:tcPr>
-            <w:tcW w:type="dxa" w:w="800"/>
-            <w:tcMar>
-              <w:top w:type="dxa" w:w="60"/>
-              <w:left w:type="dxa" w:w="100"/>
-              <w:bottom w:type="dxa" w:w="60"/>
-              <w:right w:type="dxa" w:w="100"/>
-            </w:tcMar>
-          </w:tcPr>
-          <w:p>
-            <w:r>
-              <w:rPr>
-                <w:rFonts w:ascii="Calibri" w:cs="Calibri" w:eastAsia="Calibri" w:hAnsi="Calibri"/>
-                <w:b w:val="false"/>
-                <w:bCs w:val="false"/>
-                <w:sz w:val="19"/>
-                <w:szCs w:val="19"/>
-              </w:rPr>
-              <w:t xml:space="preserve">B</w:t>
-            </w:r>
-          </w:p>
-        </w:tc>
-        <w:tc>
-          <w:tcPr>
-            <w:tcW w:type="dxa" w:w="4338"/>
-            <w:tcMar>
-              <w:top w:type="dxa" w:w="60"/>
-              <w:left w:type="dxa" w:w="100"/>
-              <w:bottom w:type="dxa" w:w="60"/>
-              <w:right w:type="dxa" w:w="100"/>
-            </w:tcMar>
-          </w:tcPr>
-          <w:p>
-            <w:r>
-              <w:rPr>
-                <w:rFonts w:ascii="Calibri" w:cs="Calibri" w:eastAsia="Calibri" w:hAnsi="Calibri"/>
-                <w:b w:val="false"/>
-                <w:bCs w:val="false"/>
-                <w:sz w:val="19"/>
-                <w:szCs w:val="19"/>
-              </w:rPr>
-              <w:t xml:space="preserve">Additional memory and allocation optimisations.</w:t>
-            </w:r>
-          </w:p>
-        </w:tc>
-        <w:tc>
-          <w:tcPr>
-            <w:tcW w:type="dxa" w:w="2200"/>
-            <w:tcMar>
-              <w:top w:type="dxa" w:w="60"/>
-              <w:left w:type="dxa" w:w="100"/>
-              <w:bottom w:type="dxa" w:w="60"/>
-              <w:right w:type="dxa" w:w="100"/>
-            </w:tcMar>
-          </w:tcPr>
-          <w:p>
-            <w:r>
-              <w:rPr>
-                <w:rFonts w:ascii="Calibri" w:cs="Calibri" w:eastAsia="Calibri" w:hAnsi="Calibri"/>
-                <w:b w:val="false"/>
-                <w:bCs w:val="false"/>
-                <w:sz w:val="19"/>
-                <w:szCs w:val="19"/>
-              </w:rPr>
-              <w:t xml:space="preserve">0.1.3 (older; test)</w:t>
-            </w:r>
-          </w:p>
-        </w:tc>
-      </w:tr>
-      <w:tr>
-        <w:tc>
-          <w:tcPr>
-            <w:tcW w:type="dxa" w:w="2300"/>
-            <w:tcMar>
-              <w:top w:type="dxa" w:w="60"/>
-              <w:left w:type="dxa" w:w="100"/>
-              <w:bottom w:type="dxa" w:w="60"/>
-              <w:right w:type="dxa" w:w="100"/>
-            </w:tcMar>
-          </w:tcPr>
-          <w:p>
-            <w:hyperlink w:history="1" r:id="rIdasanc8b91zigmi_jwxz3q">
+            <w:hyperlink w:history="1" r:id="rId2cjxts0ld3uykj5pgl7q3">
               <w:r>
                 <w:rPr>
                   <w:rStyle w:val="Hyperlink"/>
@@ -3113,223 +2993,7 @@
             </w:tcMar>
           </w:tcPr>
           <w:p>
-            <w:hyperlink w:history="1" r:id="rIdsqputrazautxla8gd9gve">
-              <w:r>
-                <w:rPr>
-                  <w:rStyle w:val="Hyperlink"/>
-                  <w:rFonts w:ascii="Calibri" w:cs="Calibri" w:eastAsia="Calibri" w:hAnsi="Calibri"/>
-                  <w:sz w:val="19"/>
-                  <w:szCs w:val="19"/>
-                </w:rPr>
-                <w:t xml:space="preserve">Epic Recruits</w:t>
-              </w:r>
-            </w:hyperlink>
-          </w:p>
-        </w:tc>
-        <w:tc>
-          <w:tcPr>
-            <w:tcW w:type="dxa" w:w="800"/>
-            <w:tcMar>
-              <w:top w:type="dxa" w:w="60"/>
-              <w:left w:type="dxa" w:w="100"/>
-              <w:bottom w:type="dxa" w:w="60"/>
-              <w:right w:type="dxa" w:w="100"/>
-            </w:tcMar>
-          </w:tcPr>
-          <w:p>
-            <w:r>
-              <w:rPr>
-                <w:rFonts w:ascii="Calibri" w:cs="Calibri" w:eastAsia="Calibri" w:hAnsi="Calibri"/>
-                <w:b w:val="false"/>
-                <w:bCs w:val="false"/>
-                <w:sz w:val="19"/>
-                <w:szCs w:val="19"/>
-              </w:rPr>
-              <w:t xml:space="preserve">B</w:t>
-            </w:r>
-          </w:p>
-        </w:tc>
-        <w:tc>
-          <w:tcPr>
-            <w:tcW w:type="dxa" w:w="6238"/>
-            <w:tcMar>
-              <w:top w:type="dxa" w:w="60"/>
-              <w:left w:type="dxa" w:w="100"/>
-              <w:bottom w:type="dxa" w:w="60"/>
-              <w:right w:type="dxa" w:w="100"/>
-            </w:tcMar>
-          </w:tcPr>
-          <w:p>
-            <w:r>
-              <w:rPr>
-                <w:rFonts w:ascii="Calibri" w:cs="Calibri" w:eastAsia="Calibri" w:hAnsi="Calibri"/>
-                <w:b w:val="false"/>
-                <w:bCs w:val="false"/>
-                <w:sz w:val="19"/>
-                <w:szCs w:val="19"/>
-              </w:rPr>
-              <w:t xml:space="preserve">Gives Villager Recruits Epic Fight animations, stances and guarding. Requires Epic Fight 20.14+ and Recruits 1.15+ (both match). Highest-value addition.</w:t>
-            </w:r>
-          </w:p>
-        </w:tc>
-      </w:tr>
-      <w:tr>
-        <w:tc>
-          <w:tcPr>
-            <w:tcW w:type="dxa" w:w="2600"/>
-            <w:tcMar>
-              <w:top w:type="dxa" w:w="60"/>
-              <w:left w:type="dxa" w:w="100"/>
-              <w:bottom w:type="dxa" w:w="60"/>
-              <w:right w:type="dxa" w:w="100"/>
-            </w:tcMar>
-          </w:tcPr>
-          <w:p>
-            <w:hyperlink w:history="1" r:id="rIdveohgbsjnmxqip_gw4ekc">
-              <w:r>
-                <w:rPr>
-                  <w:rStyle w:val="Hyperlink"/>
-                  <w:rFonts w:ascii="Calibri" w:cs="Calibri" w:eastAsia="Calibri" w:hAnsi="Calibri"/>
-                  <w:sz w:val="19"/>
-                  <w:szCs w:val="19"/>
-                </w:rPr>
-                <w:t xml:space="preserve">Epic Fight Compat Suite</w:t>
-              </w:r>
-            </w:hyperlink>
-          </w:p>
-        </w:tc>
-        <w:tc>
-          <w:tcPr>
-            <w:tcW w:type="dxa" w:w="800"/>
-            <w:tcMar>
-              <w:top w:type="dxa" w:w="60"/>
-              <w:left w:type="dxa" w:w="100"/>
-              <w:bottom w:type="dxa" w:w="60"/>
-              <w:right w:type="dxa" w:w="100"/>
-            </w:tcMar>
-          </w:tcPr>
-          <w:p>
-            <w:r>
-              <w:rPr>
-                <w:rFonts w:ascii="Calibri" w:cs="Calibri" w:eastAsia="Calibri" w:hAnsi="Calibri"/>
-                <w:b w:val="false"/>
-                <w:bCs w:val="false"/>
-                <w:sz w:val="19"/>
-                <w:szCs w:val="19"/>
-              </w:rPr>
-              <w:t xml:space="preserve">B</w:t>
-            </w:r>
-          </w:p>
-        </w:tc>
-        <w:tc>
-          <w:tcPr>
-            <w:tcW w:type="dxa" w:w="6238"/>
-            <w:tcMar>
-              <w:top w:type="dxa" w:w="60"/>
-              <w:left w:type="dxa" w:w="100"/>
-              <w:bottom w:type="dxa" w:w="60"/>
-              <w:right w:type="dxa" w:w="100"/>
-            </w:tcMar>
-          </w:tcPr>
-          <w:p>
-            <w:r>
-              <w:rPr>
-                <w:rFonts w:ascii="Calibri" w:cs="Calibri" w:eastAsia="Calibri" w:hAnsi="Calibri"/>
-                <w:b w:val="false"/>
-                <w:bCs w:val="false"/>
-                <w:sz w:val="19"/>
-                <w:szCs w:val="19"/>
-              </w:rPr>
-              <w:t xml:space="preserve">Epic Fight movesets for Epic Knights weapons (Epic Knights is now in the pack) and other weapon mods.</w:t>
-            </w:r>
-          </w:p>
-        </w:tc>
-      </w:tr>
-      <w:tr>
-        <w:tc>
-          <w:tcPr>
-            <w:tcW w:type="dxa" w:w="2600"/>
-            <w:tcMar>
-              <w:top w:type="dxa" w:w="60"/>
-              <w:left w:type="dxa" w:w="100"/>
-              <w:bottom w:type="dxa" w:w="60"/>
-              <w:right w:type="dxa" w:w="100"/>
-            </w:tcMar>
-          </w:tcPr>
-          <w:p>
-            <w:hyperlink w:history="1" r:id="rIdnfnpms_tg-psshrmcj7ko">
-              <w:r>
-                <w:rPr>
-                  <w:rStyle w:val="Hyperlink"/>
-                  <w:rFonts w:ascii="Calibri" w:cs="Calibri" w:eastAsia="Calibri" w:hAnsi="Calibri"/>
-                  <w:sz w:val="19"/>
-                  <w:szCs w:val="19"/>
-                </w:rPr>
-                <w:t xml:space="preserve">Epic Fight &amp; Cataclysm compatibility</w:t>
-              </w:r>
-            </w:hyperlink>
-          </w:p>
-        </w:tc>
-        <w:tc>
-          <w:tcPr>
-            <w:tcW w:type="dxa" w:w="800"/>
-            <w:tcMar>
-              <w:top w:type="dxa" w:w="60"/>
-              <w:left w:type="dxa" w:w="100"/>
-              <w:bottom w:type="dxa" w:w="60"/>
-              <w:right w:type="dxa" w:w="100"/>
-            </w:tcMar>
-          </w:tcPr>
-          <w:p>
-            <w:r>
-              <w:rPr>
-                <w:rFonts w:ascii="Calibri" w:cs="Calibri" w:eastAsia="Calibri" w:hAnsi="Calibri"/>
-                <w:b w:val="false"/>
-                <w:bCs w:val="false"/>
-                <w:sz w:val="19"/>
-                <w:szCs w:val="19"/>
-              </w:rPr>
-              <w:t xml:space="preserve">B</w:t>
-            </w:r>
-          </w:p>
-        </w:tc>
-        <w:tc>
-          <w:tcPr>
-            <w:tcW w:type="dxa" w:w="6238"/>
-            <w:tcMar>
-              <w:top w:type="dxa" w:w="60"/>
-              <w:left w:type="dxa" w:w="100"/>
-              <w:bottom w:type="dxa" w:w="60"/>
-              <w:right w:type="dxa" w:w="100"/>
-            </w:tcMar>
-          </w:tcPr>
-          <w:p>
-            <w:r>
-              <w:rPr>
-                <w:rFonts w:ascii="Calibri" w:cs="Calibri" w:eastAsia="Calibri" w:hAnsi="Calibri"/>
-                <w:b w:val="false"/>
-                <w:bCs w:val="false"/>
-                <w:sz w:val="19"/>
-                <w:szCs w:val="19"/>
-              </w:rPr>
-              <w:t xml:space="preserve">Correct Epic Fight styles for Cataclysm's 3D weapons.</w:t>
-            </w:r>
-          </w:p>
-        </w:tc>
-      </w:tr>
-      <w:tr>
-        <w:tc>
-          <w:tcPr>
-            <w:tcW w:type="dxa" w:w="2600"/>
-            <w:tcMar>
-              <w:top w:type="dxa" w:w="60"/>
-              <w:left w:type="dxa" w:w="100"/>
-              <w:bottom w:type="dxa" w:w="60"/>
-              <w:right w:type="dxa" w:w="100"/>
-            </w:tcMar>
-          </w:tcPr>
-          <w:p>
-            <w:hyperlink w:history="1" r:id="rIdaltbozkaw-hrblddakmbq">
+            <w:hyperlink w:history="1" r:id="rIdzbw-9d8cfe4-hjoq2g95h">
               <w:r>
                 <w:rPr>
                   <w:rStyle w:val="Hyperlink"/>
@@ -3401,7 +3065,7 @@
             </w:tcMar>
           </w:tcPr>
           <w:p>
-            <w:hyperlink w:history="1" r:id="rId-1fg-7blzqzyusno8tpjq">
+            <w:hyperlink w:history="1" r:id="rIdvew5l-l3n81oeudeupws_">
               <w:r>
                 <w:rPr>
                   <w:rStyle w:val="Hyperlink"/>
@@ -3473,7 +3137,7 @@
             </w:tcMar>
           </w:tcPr>
           <w:p>
-            <w:hyperlink w:history="1" r:id="rIdnob9sv_nupauodgrf2xfh">
+            <w:hyperlink w:history="1" r:id="rIdc03klin9ton5qkcw7lvay">
               <w:r>
                 <w:rPr>
                   <w:rStyle w:val="Hyperlink"/>
@@ -3545,7 +3209,7 @@
             </w:tcMar>
           </w:tcPr>
           <w:p>
-            <w:hyperlink w:history="1" r:id="rIdsrmrdxbweksgsewpibzmj">
+            <w:hyperlink w:history="1" r:id="rIdamz1jotdziuv5hgjrcxnk">
               <w:r>
                 <w:rPr>
                   <w:rStyle w:val="Hyperlink"/>
@@ -3617,7 +3281,7 @@
             </w:tcMar>
           </w:tcPr>
           <w:p>
-            <w:hyperlink w:history="1" r:id="rIdiiz3h6dyrsbxkek5-pzgd">
+            <w:hyperlink w:history="1" r:id="rIdx6i4c-lmlmwtq-m0wjsnl">
               <w:r>
                 <w:rPr>
                   <w:rStyle w:val="Hyperlink"/>
@@ -3689,7 +3353,7 @@
             </w:tcMar>
           </w:tcPr>
           <w:p>
-            <w:hyperlink w:history="1" r:id="rIdcdjg_uvr94d4decm0jqjo">
+            <w:hyperlink w:history="1" r:id="rIdqsu0dzgbmqfjhnoyqcywi">
               <w:r>
                 <w:rPr>
                   <w:rStyle w:val="Hyperlink"/>
@@ -3761,7 +3425,7 @@
             </w:tcMar>
           </w:tcPr>
           <w:p>
-            <w:hyperlink w:history="1" r:id="rId9bu6tkeb5wd0hooowtg1o">
+            <w:hyperlink w:history="1" r:id="rIdfv0w59vwhonir2umxr6ah">
               <w:r>
                 <w:rPr>
                   <w:rStyle w:val="Hyperlink"/>
@@ -3833,7 +3497,7 @@
             </w:tcMar>
           </w:tcPr>
           <w:p>
-            <w:hyperlink w:history="1" r:id="rIdotz7h_uzszke12a3dckk2">
+            <w:hyperlink w:history="1" r:id="rIdac12fnwe5vevb5wu72ruq">
               <w:r>
                 <w:rPr>
                   <w:rStyle w:val="Hyperlink"/>
@@ -3905,7 +3569,7 @@
             </w:tcMar>
           </w:tcPr>
           <w:p>
-            <w:hyperlink w:history="1" r:id="rIdzxcgvdv_mh7lsaw5urilc">
+            <w:hyperlink w:history="1" r:id="rIdwbgcuigquys7e-sdcmrl_">
               <w:r>
                 <w:rPr>
                   <w:rStyle w:val="Hyperlink"/>
@@ -3977,7 +3641,7 @@
             </w:tcMar>
           </w:tcPr>
           <w:p>
-            <w:hyperlink w:history="1" r:id="rIdxzvj8srpdo2hfnt_dccoc">
+            <w:hyperlink w:history="1" r:id="rIdzoml7d-hma3pymlz1dlpb">
               <w:r>
                 <w:rPr>
                   <w:rStyle w:val="Hyperlink"/>
@@ -4049,79 +3713,7 @@
             </w:tcMar>
           </w:tcPr>
           <w:p>
-            <w:hyperlink w:history="1" r:id="rIdr77uwrshdhwnshxkfqtgg">
-              <w:r>
-                <w:rPr>
-                  <w:rStyle w:val="Hyperlink"/>
-                  <w:rFonts w:ascii="Calibri" w:cs="Calibri" w:eastAsia="Calibri" w:hAnsi="Calibri"/>
-                  <w:sz w:val="19"/>
-                  <w:szCs w:val="19"/>
-                </w:rPr>
-                <w:t xml:space="preserve">Mouse Tweaks</w:t>
-              </w:r>
-            </w:hyperlink>
-          </w:p>
-        </w:tc>
-        <w:tc>
-          <w:tcPr>
-            <w:tcW w:type="dxa" w:w="800"/>
-            <w:tcMar>
-              <w:top w:type="dxa" w:w="60"/>
-              <w:left w:type="dxa" w:w="100"/>
-              <w:bottom w:type="dxa" w:w="60"/>
-              <w:right w:type="dxa" w:w="100"/>
-            </w:tcMar>
-          </w:tcPr>
-          <w:p>
-            <w:r>
-              <w:rPr>
-                <w:rFonts w:ascii="Calibri" w:cs="Calibri" w:eastAsia="Calibri" w:hAnsi="Calibri"/>
-                <w:b w:val="false"/>
-                <w:bCs w:val="false"/>
-                <w:sz w:val="19"/>
-                <w:szCs w:val="19"/>
-              </w:rPr>
-              <w:t xml:space="preserve">C</w:t>
-            </w:r>
-          </w:p>
-        </w:tc>
-        <w:tc>
-          <w:tcPr>
-            <w:tcW w:type="dxa" w:w="6238"/>
-            <w:tcMar>
-              <w:top w:type="dxa" w:w="60"/>
-              <w:left w:type="dxa" w:w="100"/>
-              <w:bottom w:type="dxa" w:w="60"/>
-              <w:right w:type="dxa" w:w="100"/>
-            </w:tcMar>
-          </w:tcPr>
-          <w:p>
-            <w:r>
-              <w:rPr>
-                <w:rFonts w:ascii="Calibri" w:cs="Calibri" w:eastAsia="Calibri" w:hAnsi="Calibri"/>
-                <w:b w:val="false"/>
-                <w:bCs w:val="false"/>
-                <w:sz w:val="19"/>
-                <w:szCs w:val="19"/>
-              </w:rPr>
-              <w:t xml:space="preserve">Faster inventory handling.</w:t>
-            </w:r>
-          </w:p>
-        </w:tc>
-      </w:tr>
-      <w:tr>
-        <w:tc>
-          <w:tcPr>
-            <w:tcW w:type="dxa" w:w="2600"/>
-            <w:tcMar>
-              <w:top w:type="dxa" w:w="60"/>
-              <w:left w:type="dxa" w:w="100"/>
-              <w:bottom w:type="dxa" w:w="60"/>
-              <w:right w:type="dxa" w:w="100"/>
-            </w:tcMar>
-          </w:tcPr>
-          <w:p>
-            <w:hyperlink w:history="1" r:id="rIdrod9kb8kxk13cotcxeuxr">
+            <w:hyperlink w:history="1" r:id="rIdhejbimf8ma9nuiizjlhky">
               <w:r>
                 <w:rPr>
                   <w:rStyle w:val="Hyperlink"/>
@@ -4193,7 +3785,7 @@
             </w:tcMar>
           </w:tcPr>
           <w:p>
-            <w:hyperlink w:history="1" r:id="rIdbffe6___xgwwu_nrfiaks">
+            <w:hyperlink w:history="1" r:id="rIdt2tanut9rmpvr_xjj0-2z">
               <w:r>
                 <w:rPr>
                   <w:rStyle w:val="Hyperlink"/>
@@ -4598,7 +4190,7 @@
           <w:sz w:val="22"/>
           <w:szCs w:val="22"/>
         </w:rPr>
-        <w:t xml:space="preserve">Verified by booting the dedicated server: each of these crashes it because it loads client-only classes. They are fine on clients joining that server.</w:t>
+        <w:t xml:space="preserve">Verified by booting the dedicated server: each of these loads client-only classes - the first five crash the server, Particle Core logs a config error. They are fine on clients joining that server.</w:t>
       </w:r>
     </w:p>
     <w:p>
@@ -4689,6 +4281,24 @@
           <w:szCs w:val="22"/>
         </w:rPr>
         <w:t xml:space="preserve">Legendary Tooltips</w:t>
+      </w:r>
+    </w:p>
+    <w:p>
+      <w:pPr>
+        <w:pStyle w:val="ListParagraph"/>
+        <w:numPr>
+          <w:ilvl w:val="0"/>
+          <w:numId w:val="2"/>
+        </w:numPr>
+        <w:spacing w:after="60"/>
+      </w:pPr>
+      <w:r>
+        <w:rPr>
+          <w:rFonts w:ascii="Calibri" w:cs="Calibri" w:eastAsia="Calibri" w:hAnsi="Calibri"/>
+          <w:sz w:val="22"/>
+          <w:szCs w:val="22"/>
+        </w:rPr>
+        <w:t xml:space="preserve">Particle Core</w:t>
       </w:r>
     </w:p>
     <w:p>
@@ -4836,7 +4446,7 @@
         </w:numPr>
         <w:spacing w:after="60"/>
       </w:pPr>
-      <w:hyperlink w:history="1" r:id="rIdpue-a7cp-fmrkgilqzidb">
+      <w:hyperlink w:history="1" r:id="rIdc1rbbls1zqajy7eqrubjw">
         <w:r>
           <w:rPr>
             <w:rStyle w:val="Hyperlink"/>
@@ -4857,7 +4467,7 @@
         </w:numPr>
         <w:spacing w:after="60"/>
       </w:pPr>
-      <w:hyperlink w:history="1" r:id="rIdkphkxav8ou2yifmroarcu">
+      <w:hyperlink w:history="1" r:id="rIds2s5i1i-7tijtrjpnq8bf">
         <w:r>
           <w:rPr>
             <w:rStyle w:val="Hyperlink"/>
@@ -4878,7 +4488,7 @@
         </w:numPr>
         <w:spacing w:after="60"/>
       </w:pPr>
-      <w:hyperlink w:history="1" r:id="rIdvvflady7iwux3k81-2kya">
+      <w:hyperlink w:history="1" r:id="rIdof1cv2zlbhewqky9tp0_a">
         <w:r>
           <w:rPr>
             <w:rStyle w:val="Hyperlink"/>
@@ -4899,7 +4509,7 @@
         </w:numPr>
         <w:spacing w:after="60"/>
       </w:pPr>
-      <w:hyperlink w:history="1" r:id="rId40sntpr0k-u11uankqyym">
+      <w:hyperlink w:history="1" r:id="rIdi5yb8qbqnb0cawbseiqn1">
         <w:r>
           <w:rPr>
             <w:rStyle w:val="Hyperlink"/>
@@ -4918,7 +4528,7 @@
         </w:rPr>
         <w:t xml:space="preserve"> / </w:t>
       </w:r>
-      <w:hyperlink w:history="1" r:id="rIdj8y8gkfhwphx0c_zi6he6">
+      <w:hyperlink w:history="1" r:id="rIdc3ppj_yzhzxdcm9csmbbb">
         <w:r>
           <w:rPr>
             <w:rStyle w:val="Hyperlink"/>
@@ -4939,7 +4549,7 @@
         </w:numPr>
         <w:spacing w:after="60"/>
       </w:pPr>
-      <w:hyperlink w:history="1" r:id="rIdwmgxa17yjbx7jydb1my0g">
+      <w:hyperlink w:history="1" r:id="rIdfehy1ioejm57dcb2wbljd">
         <w:r>
           <w:rPr>
             <w:rStyle w:val="Hyperlink"/>
@@ -4960,7 +4570,7 @@
         </w:numPr>
         <w:spacing w:after="60"/>
       </w:pPr>
-      <w:hyperlink w:history="1" r:id="rId1escnxoswq8-etaslylr-">
+      <w:hyperlink w:history="1" r:id="rId66muxcuknmticitp_v2wk">
         <w:r>
           <w:rPr>
             <w:rStyle w:val="Hyperlink"/>
@@ -4981,7 +4591,7 @@
         </w:numPr>
         <w:spacing w:after="60"/>
       </w:pPr>
-      <w:hyperlink w:history="1" r:id="rIdrrydyzrkgbvcozltmxowa">
+      <w:hyperlink w:history="1" r:id="rIdtzpuivfyodlf3kwni_xs_">
         <w:r>
           <w:rPr>
             <w:rStyle w:val="Hyperlink"/>
@@ -5000,7 +4610,7 @@
         </w:rPr>
         <w:t xml:space="preserve"> · </w:t>
       </w:r>
-      <w:hyperlink w:history="1" r:id="rIda1huuwiqaawmgcz1ejzil">
+      <w:hyperlink w:history="1" r:id="rIdoprn4x8nl9bessyz5rlup">
         <w:r>
           <w:rPr>
             <w:rStyle w:val="Hyperlink"/>

</xml_diff>